<commit_message>
feat(ats-supremo): sprints 1-3 — generate_cv_files v2 (Heading+hyperlinks+metadata+filename profesional), validate_ats.py (bilingüe), cv_master.yaml como fuente única + yaml_to_md.py, keyword_match.py, CI cv.yml, spec docs + 38 PDFs/DOCXs regenerados (100% PASS)
</commit_message>
<xml_diff>
--- a/CV_Material_Nacho/extras/cvs_personalizados/cv_adecco_calidad.docx
+++ b/CV_Material_Nacho/extras/cvs_personalizados/cv_adecco_calidad.docx
@@ -4,19 +4,28 @@
   <w:body>
     <w:p>
       <w:r>
+        <w:rPr>
+          <w:b/>
+          <w:sz w:val="32"/>
+        </w:rPr>
         <w:t>Ignacio Palmeri</w:t>
       </w:r>
     </w:p>
     <w:p>
+      <w:pPr/>
       <w:r>
+        <w:rPr>
+          <w:color w:val="555555"/>
+          <w:sz w:val="17"/>
+        </w:rPr>
         <w:t>Temperley, Buenos Aires, Argentina | +54 9 11 5509-0832 | ignaciopalmeri1@gmail.com | linkedin.com/in/ignaciopalmeri | github.com/nachopalmeri | ignaciopalmeri.vercel.app</w:t>
       </w:r>
     </w:p>
     <w:p>
+      <w:pPr>
+        <w:pStyle w:val="Heading1"/>
+      </w:pPr>
       <w:r>
-        <w:rPr>
-          <w:b/>
-        </w:rPr>
         <w:t>PERFIL PROFESIONAL</w:t>
       </w:r>
     </w:p>
@@ -26,16 +35,22 @@
       </w:r>
     </w:p>
     <w:p>
+      <w:pPr>
+        <w:pStyle w:val="Heading1"/>
+      </w:pPr>
       <w:r>
-        <w:rPr>
-          <w:b/>
-        </w:rPr>
         <w:t>EDUCACIÓN</w:t>
       </w:r>
     </w:p>
     <w:p>
       <w:r>
-        <w:t>Licenciatura en Gestión de Tecnologías de la Información — UADE | Mar 2025 – Dic 2028 (estimado)</w:t>
+        <w:rPr>
+          <w:b/>
+        </w:rPr>
+        <w:t>Licenciatura en Gestión de Tecnologías de la Información — UADE</w:t>
+      </w:r>
+      <w:r>
+        <w:t xml:space="preserve"> | Mar 2025 – Dic 2028 (estimado)</w:t>
       </w:r>
     </w:p>
     <w:p>
@@ -56,7 +71,13 @@
     </w:p>
     <w:p>
       <w:r>
-        <w:t>Bachiller en Economía y Administración — Colegio Eccleston | Egresado 20/12/2024</w:t>
+        <w:rPr>
+          <w:b/>
+        </w:rPr>
+        <w:t>Bachiller en Economía y Administración — Colegio Eccleston</w:t>
+      </w:r>
+      <w:r>
+        <w:t xml:space="preserve"> | Egresado 20/12/2024</w:t>
       </w:r>
     </w:p>
     <w:p>
@@ -68,16 +89,22 @@
       </w:r>
     </w:p>
     <w:p>
+      <w:pPr>
+        <w:pStyle w:val="Heading1"/>
+      </w:pPr>
       <w:r>
-        <w:rPr>
-          <w:b/>
-        </w:rPr>
         <w:t>EXPERIENCIA</w:t>
       </w:r>
     </w:p>
     <w:p>
       <w:r>
-        <w:t>Representante de Atención al Cliente — Grido (franquicia) | Oct 2023 – Presente</w:t>
+        <w:rPr>
+          <w:b/>
+        </w:rPr>
+        <w:t>Representante de Atención al Cliente — Grido (franquicia)</w:t>
+      </w:r>
+      <w:r>
+        <w:t xml:space="preserve"> | Oct 2023 – Presente</w:t>
       </w:r>
     </w:p>
     <w:p>
@@ -113,16 +140,22 @@
       </w:r>
     </w:p>
     <w:p>
+      <w:pPr>
+        <w:pStyle w:val="Heading1"/>
+      </w:pPr>
       <w:r>
-        <w:rPr>
-          <w:b/>
-        </w:rPr>
         <w:t>PROYECTOS (DASHBOARDS, DATOS Y AUTOMATIZACIÓN)</w:t>
       </w:r>
     </w:p>
     <w:p>
       <w:r>
-        <w:t>FranquiYA — Dashboard full-stack para operaciones de franquicia | 2025 – 2026</w:t>
+        <w:rPr>
+          <w:b/>
+        </w:rPr>
+        <w:t>FranquiYA — Dashboard full-stack para operaciones de franquicia</w:t>
+      </w:r>
+      <w:r>
+        <w:t xml:space="preserve"> | 2025 – 2026</w:t>
       </w:r>
     </w:p>
     <w:p>
@@ -148,7 +181,13 @@
     </w:p>
     <w:p>
       <w:r>
-        <w:t>Prode Mundial 2026 — Motor estadístico de predicción deportiva | 2026</w:t>
+        <w:rPr>
+          <w:b/>
+        </w:rPr>
+        <w:t>Prode Mundial 2026 — Motor estadístico de predicción deportiva</w:t>
+      </w:r>
+      <w:r>
+        <w:t xml:space="preserve"> | 2026</w:t>
       </w:r>
     </w:p>
     <w:p>
@@ -174,7 +213,13 @@
     </w:p>
     <w:p>
       <w:r>
-        <w:t>JobBot — Asistente de búsqueda laboral con IA (bot + dashboard) | 2026</w:t>
+        <w:rPr>
+          <w:b/>
+        </w:rPr>
+        <w:t>JobBot — Asistente de búsqueda laboral con IA (bot + dashboard)</w:t>
+      </w:r>
+      <w:r>
+        <w:t xml:space="preserve"> | 2026</w:t>
       </w:r>
     </w:p>
     <w:p>
@@ -200,7 +245,13 @@
     </w:p>
     <w:p>
       <w:r>
-        <w:t>Agents System — Workflow personal de automatización con IA | 2026</w:t>
+        <w:rPr>
+          <w:b/>
+        </w:rPr>
+        <w:t>Agents System — Workflow personal de automatización con IA</w:t>
+      </w:r>
+      <w:r>
+        <w:t xml:space="preserve"> | 2026</w:t>
       </w:r>
     </w:p>
     <w:p>
@@ -225,10 +276,10 @@
       </w:r>
     </w:p>
     <w:p>
+      <w:pPr>
+        <w:pStyle w:val="Heading1"/>
+      </w:pPr>
       <w:r>
-        <w:rPr>
-          <w:b/>
-        </w:rPr>
         <w:t>COMPETENCIAS TÉCNICAS</w:t>
       </w:r>
     </w:p>
@@ -237,7 +288,13 @@
         <w:pStyle w:val="ListBullet"/>
       </w:pPr>
       <w:r>
-        <w:t>Datos y reportes: Excel avanzado (fórmulas, tablas dinámicas, cruce de datos — planillas propias en uso), SQL, PostgreSQL, SQLite, Python (pandas, NumPy), dashboards con Next.js/React</w:t>
+        <w:rPr>
+          <w:b/>
+        </w:rPr>
+        <w:t>Datos y reportes:</w:t>
+      </w:r>
+      <w:r>
+        <w:t xml:space="preserve"> Excel avanzado (fórmulas, tablas dinámicas, cruce de datos — planillas propias en uso), SQL, PostgreSQL, SQLite, Python (pandas, NumPy), dashboards con Next.js/React</w:t>
       </w:r>
     </w:p>
     <w:p>
@@ -245,7 +302,13 @@
         <w:pStyle w:val="ListBullet"/>
       </w:pPr>
       <w:r>
-        <w:t>IA aplicada: LLMs (Claude, Groq, Gemini), ingeniería de prompts, agentes y flujos de automatización, desarrollo de asistente virtual (bot con IA)</w:t>
+        <w:rPr>
+          <w:b/>
+        </w:rPr>
+        <w:t>IA aplicada:</w:t>
+      </w:r>
+      <w:r>
+        <w:t xml:space="preserve"> LLMs (Claude, Groq, Gemini), ingeniería de prompts, agentes y flujos de automatización, desarrollo de asistente virtual (bot con IA)</w:t>
       </w:r>
     </w:p>
     <w:p>
@@ -253,7 +316,13 @@
         <w:pStyle w:val="ListBullet"/>
       </w:pPr>
       <w:r>
-        <w:t>Lenguajes y frameworks: Python, JavaScript, TypeScript, FastAPI, Next.js, React</w:t>
+        <w:rPr>
+          <w:b/>
+        </w:rPr>
+        <w:t>Lenguajes y frameworks:</w:t>
+      </w:r>
+      <w:r>
+        <w:t xml:space="preserve"> Python, JavaScript, TypeScript, FastAPI, Next.js, React</w:t>
       </w:r>
     </w:p>
     <w:p>
@@ -261,7 +330,13 @@
         <w:pStyle w:val="ListBullet"/>
       </w:pPr>
       <w:r>
-        <w:t>Infraestructura: Linux (RHEL/Ubuntu, WSL2), Git/GitHub, GitHub Actions, Vercel, Bash</w:t>
+        <w:rPr>
+          <w:b/>
+        </w:rPr>
+        <w:t>Infraestructura:</w:t>
+      </w:r>
+      <w:r>
+        <w:t xml:space="preserve"> Linux (RHEL/Ubuntu, WSL2), Git/GitHub, GitHub Actions, Vercel, Bash</w:t>
       </w:r>
     </w:p>
     <w:p>
@@ -269,14 +344,20 @@
         <w:pStyle w:val="ListBullet"/>
       </w:pPr>
       <w:r>
-        <w:t>Negocio y servicio: Atención al cliente, vocación de servicio, mejora continua de procesos, documentación de procedimientos, trabajo bajo presión, metodologías ágiles</w:t>
+        <w:rPr>
+          <w:b/>
+        </w:rPr>
+        <w:t>Negocio y servicio:</w:t>
+      </w:r>
+      <w:r>
+        <w:t xml:space="preserve"> Atención al cliente, vocación de servicio, mejora continua de procesos, documentación de procedimientos, trabajo bajo presión, metodologías ágiles</w:t>
       </w:r>
     </w:p>
     <w:p>
+      <w:pPr>
+        <w:pStyle w:val="Heading1"/>
+      </w:pPr>
       <w:r>
-        <w:rPr>
-          <w:b/>
-        </w:rPr>
         <w:t>CERTIFICACIONES</w:t>
       </w:r>
     </w:p>
@@ -285,7 +366,13 @@
         <w:pStyle w:val="ListBullet"/>
       </w:pPr>
       <w:r>
-        <w:t>Red Hat System Administration I (RH124) — Red Hat Academy, 2025.</w:t>
+        <w:rPr>
+          <w:b/>
+        </w:rPr>
+        <w:t>Red Hat System Administration I (RH124)</w:t>
+      </w:r>
+      <w:r>
+        <w:t xml:space="preserve"> — Red Hat Academy, 2025.</w:t>
       </w:r>
     </w:p>
     <w:p>
@@ -293,7 +380,13 @@
         <w:pStyle w:val="ListBullet"/>
       </w:pPr>
       <w:r>
-        <w:t>Claude Code in Action — Anthropic, 2026.</w:t>
+        <w:rPr>
+          <w:b/>
+        </w:rPr>
+        <w:t>Claude Code in Action</w:t>
+      </w:r>
+      <w:r>
+        <w:t xml:space="preserve"> — Anthropic, 2026.</w:t>
       </w:r>
     </w:p>
     <w:p>
@@ -301,7 +394,13 @@
         <w:pStyle w:val="ListBullet"/>
       </w:pPr>
       <w:r>
-        <w:t>CCNA 1: Introduction to Networks (track Cisco) — UADE, en curso, finalización estimada dic 2026.</w:t>
+        <w:rPr>
+          <w:b/>
+        </w:rPr>
+        <w:t>CCNA 1: Introduction to Networks (track Cisco)</w:t>
+      </w:r>
+      <w:r>
+        <w:t xml:space="preserve"> — UADE, en curso, finalización estimada dic 2026.</w:t>
       </w:r>
     </w:p>
     <w:p>
@@ -313,10 +412,10 @@
       </w:r>
     </w:p>
     <w:p>
+      <w:pPr>
+        <w:pStyle w:val="Heading1"/>
+      </w:pPr>
       <w:r>
-        <w:rPr>
-          <w:b/>
-        </w:rPr>
         <w:t>IDIOMAS</w:t>
       </w:r>
     </w:p>
@@ -337,10 +436,10 @@
       </w:r>
     </w:p>
     <w:p>
+      <w:pPr>
+        <w:pStyle w:val="Heading1"/>
+      </w:pPr>
       <w:r>
-        <w:rPr>
-          <w:b/>
-        </w:rPr>
         <w:t>DISPONIBILIDAD</w:t>
       </w:r>
     </w:p>
@@ -797,11 +896,11 @@
       <w:outlineLvl w:val="0"/>
     </w:pPr>
     <w:rPr>
-      <w:rFonts w:asciiTheme="majorHAnsi" w:eastAsiaTheme="majorEastAsia" w:hAnsiTheme="majorHAnsi" w:cstheme="majorBidi"/>
+      <w:rFonts w:asciiTheme="majorHAnsi" w:eastAsiaTheme="majorEastAsia" w:hAnsiTheme="majorHAnsi" w:cstheme="majorBidi" w:ascii="Calibri" w:hAnsi="Calibri"/>
       <w:b/>
       <w:bCs/>
-      <w:color w:val="365F91" w:themeColor="accent1" w:themeShade="BF"/>
-      <w:sz w:val="28"/>
+      <w:color w:val="1A1A1A"/>
+      <w:sz w:val="22"/>
       <w:szCs w:val="28"/>
     </w:rPr>
   </w:style>
@@ -821,11 +920,11 @@
       <w:outlineLvl w:val="1"/>
     </w:pPr>
     <w:rPr>
-      <w:rFonts w:asciiTheme="majorHAnsi" w:eastAsiaTheme="majorEastAsia" w:hAnsiTheme="majorHAnsi" w:cstheme="majorBidi"/>
+      <w:rFonts w:asciiTheme="majorHAnsi" w:eastAsiaTheme="majorEastAsia" w:hAnsiTheme="majorHAnsi" w:cstheme="majorBidi" w:ascii="Calibri" w:hAnsi="Calibri"/>
       <w:b/>
       <w:bCs/>
-      <w:color w:val="4F81BD" w:themeColor="accent1"/>
-      <w:sz w:val="26"/>
+      <w:color w:val="1A1A1A"/>
+      <w:sz w:val="20"/>
       <w:szCs w:val="26"/>
     </w:rPr>
   </w:style>

</xml_diff>